<commit_message>
Deploying to gh-pages from @ Morrison-Lab/wai@66b003bd8a1cf4df1622ab7e16e5b1bafee6bf13 🚀
</commit_message>
<xml_diff>
--- a/index.docx
+++ b/index.docx
@@ -15,7 +15,7 @@
         <w:pStyle w:val="Date"/>
       </w:pPr>
       <w:r>
-        <w:t xml:space="preserve">Last modified: 2026-08-05 16:27:49 (PDT)</w:t>
+        <w:t xml:space="preserve">Last modified: 2026-08-05 17:30:25 (PDT)</w:t>
       </w:r>
     </w:p>
     <w:p>
@@ -228,7 +228,7 @@
         </w:tc>
       </w:tr>
     </w:tbl>
-    <w:bookmarkStart w:id="16" w:name="chapters"/>
+    <w:bookmarkStart w:id="17" w:name="chapters"/>
     <w:p>
       <w:pPr>
         <w:pStyle w:val="Heading2"/>
@@ -326,6 +326,46 @@
             <w:b/>
             <w:bCs/>
           </w:rPr>
+          <w:t xml:space="preserve">Orchestrating Teams of Agents</w:t>
+        </w:r>
+      </w:hyperlink>
+      <w:r>
+        <w:t xml:space="preserve">:</w:t>
+      </w:r>
+      <w:r>
+        <w:t xml:space="preserve"> </w:t>
+      </w:r>
+      <w:r>
+        <w:t xml:space="preserve">when running several agents at once is worth the cost, what we already use</w:t>
+      </w:r>
+      <w:r>
+        <w:t xml:space="preserve"> </w:t>
+      </w:r>
+      <w:r>
+        <w:t xml:space="preserve">for it, and how three outside orchestrators (Agent Teams, Inflexa, TORQCLAW)</w:t>
+      </w:r>
+      <w:r>
+        <w:t xml:space="preserve"> </w:t>
+      </w:r>
+      <w:r>
+        <w:t xml:space="preserve">compare</w:t>
+      </w:r>
+    </w:p>
+    <w:p>
+      <w:pPr>
+        <w:pStyle w:val="Compact"/>
+        <w:numPr>
+          <w:ilvl w:val="0"/>
+          <w:numId w:val="1001"/>
+        </w:numPr>
+      </w:pPr>
+      <w:hyperlink r:id="rId16">
+        <w:r>
+          <w:rPr>
+            <w:rStyle w:val="Hyperlink"/>
+            <w:b/>
+            <w:bCs/>
+          </w:rPr>
           <w:t xml:space="preserve">Pull-Request Workflow with Agents</w:t>
         </w:r>
       </w:hyperlink>
@@ -474,8 +514,8 @@
         <w:t xml:space="preserve">extension</w:t>
       </w:r>
     </w:p>
-    <w:bookmarkEnd w:id="16"/>
-    <w:bookmarkStart w:id="19" w:name="about-this-website"/>
+    <w:bookmarkEnd w:id="17"/>
+    <w:bookmarkStart w:id="20" w:name="about-this-website"/>
     <w:p>
       <w:pPr>
         <w:pStyle w:val="Heading2"/>
@@ -494,7 +534,7 @@
       <w:r>
         <w:t xml:space="preserve"> </w:t>
       </w:r>
-      <w:hyperlink r:id="rId17">
+      <w:hyperlink r:id="rId18">
         <w:r>
           <w:rPr>
             <w:rStyle w:val="Hyperlink"/>
@@ -508,7 +548,7 @@
       <w:r>
         <w:t xml:space="preserve"> </w:t>
       </w:r>
-      <w:hyperlink r:id="rId18">
+      <w:hyperlink r:id="rId19">
         <w:r>
           <w:rPr>
             <w:rStyle w:val="Hyperlink"/>
@@ -544,8 +584,8 @@
         <w:t xml:space="preserve">.</w:t>
       </w:r>
     </w:p>
-    <w:bookmarkEnd w:id="19"/>
-    <w:bookmarkStart w:id="20" w:name="building-the-website"/>
+    <w:bookmarkEnd w:id="20"/>
+    <w:bookmarkStart w:id="21" w:name="building-the-website"/>
     <w:p>
       <w:pPr>
         <w:pStyle w:val="Heading2"/>
@@ -627,8 +667,8 @@
         <w:t xml:space="preserve">directory, which is published to GitHub Pages.</w:t>
       </w:r>
     </w:p>
-    <w:bookmarkEnd w:id="20"/>
-    <w:bookmarkStart w:id="22" w:name="license"/>
+    <w:bookmarkEnd w:id="21"/>
+    <w:bookmarkStart w:id="23" w:name="license"/>
     <w:p>
       <w:pPr>
         <w:pStyle w:val="Heading2"/>
@@ -647,7 +687,7 @@
       <w:r>
         <w:t xml:space="preserve"> </w:t>
       </w:r>
-      <w:hyperlink r:id="rId21">
+      <w:hyperlink r:id="rId22">
         <w:r>
           <w:rPr>
             <w:rStyle w:val="VerbatimChar"/>
@@ -659,8 +699,8 @@
         <w:t xml:space="preserve">.</w:t>
       </w:r>
     </w:p>
-    <w:bookmarkEnd w:id="22"/>
-    <w:bookmarkStart w:id="24" w:name="references"/>
+    <w:bookmarkEnd w:id="23"/>
+    <w:bookmarkStart w:id="25" w:name="references"/>
     <w:p>
       <w:pPr>
         <w:pStyle w:val="Heading2"/>
@@ -669,9 +709,9 @@
         <w:t xml:space="preserve">References</w:t>
       </w:r>
     </w:p>
-    <w:bookmarkStart w:id="23" w:name="refs"/>
-    <w:bookmarkEnd w:id="23"/>
+    <w:bookmarkStart w:id="24" w:name="refs"/>
     <w:bookmarkEnd w:id="24"/>
+    <w:bookmarkEnd w:id="25"/>
     <w:sectPr>
       <w:footnotePr>
         <w:numRestart w:val="eachSect"/>

</xml_diff>

<commit_message>
Deploying to gh-pages from @ Morrison-Lab/wai@b722c90d3eef0e613c557f154d652f0238629f14 🚀
</commit_message>
<xml_diff>
--- a/index.docx
+++ b/index.docx
@@ -15,7 +15,7 @@
         <w:pStyle w:val="Date"/>
       </w:pPr>
       <w:r>
-        <w:t xml:space="preserve">Last modified: 2026-08-29 21:59:18 (PDT)</w:t>
+        <w:t xml:space="preserve">Last modified: 2026-08-29 22:06:57 (PDT)</w:t>
       </w:r>
     </w:p>
     <w:p>
@@ -228,7 +228,7 @@
         </w:tc>
       </w:tr>
     </w:tbl>
-    <w:bookmarkStart w:id="18" w:name="chapters"/>
+    <w:bookmarkStart w:id="20" w:name="chapters"/>
     <w:p>
       <w:pPr>
         <w:pStyle w:val="Heading2"/>
@@ -400,6 +400,54 @@
             <w:b/>
             <w:bCs/>
           </w:rPr>
+          <w:t xml:space="preserve">Benchbook: A Personal Wiki Under Contract</w:t>
+        </w:r>
+      </w:hyperlink>
+      <w:r>
+        <w:t xml:space="preserve">:</w:t>
+      </w:r>
+      <w:r>
+        <w:t xml:space="preserve"> </w:t>
+      </w:r>
+      <w:r>
+        <w:t xml:space="preserve">a plain-markdown, git-versioned wiki that an AI agent maintains under a</w:t>
+      </w:r>
+      <w:r>
+        <w:t xml:space="preserve"> </w:t>
+      </w:r>
+      <w:r>
+        <w:t xml:space="preserve">written contract (see</w:t>
+      </w:r>
+      <w:r>
+        <w:t xml:space="preserve"> </w:t>
+      </w:r>
+      <w:hyperlink r:id="rId18">
+        <w:r>
+          <w:rPr>
+            <w:rStyle w:val="Hyperlink"/>
+          </w:rPr>
+          <w:t xml:space="preserve">benchbook</w:t>
+        </w:r>
+      </w:hyperlink>
+      <w:r>
+        <w:t xml:space="preserve">)</w:t>
+      </w:r>
+    </w:p>
+    <w:p>
+      <w:pPr>
+        <w:pStyle w:val="Compact"/>
+        <w:numPr>
+          <w:ilvl w:val="0"/>
+          <w:numId w:val="1001"/>
+        </w:numPr>
+      </w:pPr>
+      <w:hyperlink r:id="rId19">
+        <w:r>
+          <w:rPr>
+            <w:rStyle w:val="Hyperlink"/>
+            <w:b/>
+            <w:bCs/>
+          </w:rPr>
           <w:t xml:space="preserve">Pull-Request Workflow with Agents</w:t>
         </w:r>
       </w:hyperlink>
@@ -548,8 +596,8 @@
         <w:t xml:space="preserve">extension</w:t>
       </w:r>
     </w:p>
-    <w:bookmarkEnd w:id="18"/>
-    <w:bookmarkStart w:id="21" w:name="about-this-website"/>
+    <w:bookmarkEnd w:id="20"/>
+    <w:bookmarkStart w:id="23" w:name="about-this-website"/>
     <w:p>
       <w:pPr>
         <w:pStyle w:val="Heading2"/>
@@ -568,7 +616,7 @@
       <w:r>
         <w:t xml:space="preserve"> </w:t>
       </w:r>
-      <w:hyperlink r:id="rId19">
+      <w:hyperlink r:id="rId21">
         <w:r>
           <w:rPr>
             <w:rStyle w:val="Hyperlink"/>
@@ -582,7 +630,7 @@
       <w:r>
         <w:t xml:space="preserve"> </w:t>
       </w:r>
-      <w:hyperlink r:id="rId20">
+      <w:hyperlink r:id="rId22">
         <w:r>
           <w:rPr>
             <w:rStyle w:val="Hyperlink"/>
@@ -618,8 +666,8 @@
         <w:t xml:space="preserve">.</w:t>
       </w:r>
     </w:p>
-    <w:bookmarkEnd w:id="21"/>
-    <w:bookmarkStart w:id="22" w:name="building-the-website"/>
+    <w:bookmarkEnd w:id="23"/>
+    <w:bookmarkStart w:id="24" w:name="building-the-website"/>
     <w:p>
       <w:pPr>
         <w:pStyle w:val="Heading2"/>
@@ -701,8 +749,8 @@
         <w:t xml:space="preserve">directory, which is published to GitHub Pages.</w:t>
       </w:r>
     </w:p>
-    <w:bookmarkEnd w:id="22"/>
-    <w:bookmarkStart w:id="24" w:name="license"/>
+    <w:bookmarkEnd w:id="24"/>
+    <w:bookmarkStart w:id="26" w:name="license"/>
     <w:p>
       <w:pPr>
         <w:pStyle w:val="Heading2"/>
@@ -721,7 +769,7 @@
       <w:r>
         <w:t xml:space="preserve"> </w:t>
       </w:r>
-      <w:hyperlink r:id="rId23">
+      <w:hyperlink r:id="rId25">
         <w:r>
           <w:rPr>
             <w:rStyle w:val="VerbatimChar"/>
@@ -733,8 +781,8 @@
         <w:t xml:space="preserve">.</w:t>
       </w:r>
     </w:p>
-    <w:bookmarkEnd w:id="24"/>
-    <w:bookmarkStart w:id="26" w:name="references"/>
+    <w:bookmarkEnd w:id="26"/>
+    <w:bookmarkStart w:id="28" w:name="references"/>
     <w:p>
       <w:pPr>
         <w:pStyle w:val="Heading2"/>
@@ -743,9 +791,9 @@
         <w:t xml:space="preserve">References</w:t>
       </w:r>
     </w:p>
-    <w:bookmarkStart w:id="25" w:name="refs"/>
-    <w:bookmarkEnd w:id="25"/>
-    <w:bookmarkEnd w:id="26"/>
+    <w:bookmarkStart w:id="27" w:name="refs"/>
+    <w:bookmarkEnd w:id="27"/>
+    <w:bookmarkEnd w:id="28"/>
     <w:sectPr>
       <w:footnotePr>
         <w:numRestart w:val="eachSect"/>

</xml_diff>

<commit_message>
Deploying to gh-pages from @ Morrison-Lab/wai@0935d82c9787123e355de99b64c2eb0d2cbe4899 🚀
</commit_message>
<xml_diff>
--- a/index.docx
+++ b/index.docx
@@ -15,7 +15,7 @@
         <w:pStyle w:val="Date"/>
       </w:pPr>
       <w:r>
-        <w:t xml:space="preserve">Last modified: 2026-08-29 22:06:57 (PDT)</w:t>
+        <w:t xml:space="preserve">Last modified: 2026-08-29 22:10:28 (PDT)</w:t>
       </w:r>
     </w:p>
     <w:p>
@@ -228,7 +228,7 @@
         </w:tc>
       </w:tr>
     </w:tbl>
-    <w:bookmarkStart w:id="20" w:name="chapters"/>
+    <w:bookmarkStart w:id="22" w:name="chapters"/>
     <w:p>
       <w:pPr>
         <w:pStyle w:val="Heading2"/>
@@ -400,6 +400,63 @@
             <w:b/>
             <w:bCs/>
           </w:rPr>
+          <w:t xml:space="preserve">Data Dictionaries for Humans and Agents</w:t>
+        </w:r>
+      </w:hyperlink>
+      <w:r>
+        <w:t xml:space="preserve">:</w:t>
+      </w:r>
+      <w:r>
+        <w:t xml:space="preserve"> </w:t>
+      </w:r>
+      <w:r>
+        <w:rPr>
+          <w:rStyle w:val="VerbatimChar"/>
+        </w:rPr>
+        <w:t xml:space="preserve">data-dict.yaml</w:t>
+      </w:r>
+      <w:r>
+        <w:t xml:space="preserve"> </w:t>
+      </w:r>
+      <w:r>
+        <w:t xml:space="preserve">for making dataset context accessible to both humans and AI</w:t>
+      </w:r>
+      <w:r>
+        <w:t xml:space="preserve"> </w:t>
+      </w:r>
+      <w:r>
+        <w:t xml:space="preserve">agents (see</w:t>
+      </w:r>
+      <w:r>
+        <w:t xml:space="preserve"> </w:t>
+      </w:r>
+      <w:hyperlink r:id="rId18">
+        <w:r>
+          <w:rPr>
+            <w:rStyle w:val="Hyperlink"/>
+          </w:rPr>
+          <w:t xml:space="preserve">data-dict.tidyverse.org</w:t>
+        </w:r>
+      </w:hyperlink>
+      <w:r>
+        <w:t xml:space="preserve">)</w:t>
+      </w:r>
+    </w:p>
+    <w:p>
+      <w:pPr>
+        <w:pStyle w:val="Compact"/>
+        <w:numPr>
+          <w:ilvl w:val="0"/>
+          <w:numId w:val="1001"/>
+        </w:numPr>
+      </w:pPr>
+      <w:hyperlink r:id="rId19">
+        <w:r>
+          <w:rPr>
+            <w:rStyle w:val="Hyperlink"/>
+            <w:b/>
+            <w:bCs/>
+          </w:rPr>
           <w:t xml:space="preserve">Benchbook: A Personal Wiki Under Contract</w:t>
         </w:r>
       </w:hyperlink>
@@ -421,7 +478,7 @@
       <w:r>
         <w:t xml:space="preserve"> </w:t>
       </w:r>
-      <w:hyperlink r:id="rId18">
+      <w:hyperlink r:id="rId20">
         <w:r>
           <w:rPr>
             <w:rStyle w:val="Hyperlink"/>
@@ -441,7 +498,7 @@
           <w:numId w:val="1001"/>
         </w:numPr>
       </w:pPr>
-      <w:hyperlink r:id="rId19">
+      <w:hyperlink r:id="rId21">
         <w:r>
           <w:rPr>
             <w:rStyle w:val="Hyperlink"/>
@@ -596,8 +653,8 @@
         <w:t xml:space="preserve">extension</w:t>
       </w:r>
     </w:p>
-    <w:bookmarkEnd w:id="20"/>
-    <w:bookmarkStart w:id="23" w:name="about-this-website"/>
+    <w:bookmarkEnd w:id="22"/>
+    <w:bookmarkStart w:id="25" w:name="about-this-website"/>
     <w:p>
       <w:pPr>
         <w:pStyle w:val="Heading2"/>
@@ -616,7 +673,7 @@
       <w:r>
         <w:t xml:space="preserve"> </w:t>
       </w:r>
-      <w:hyperlink r:id="rId21">
+      <w:hyperlink r:id="rId23">
         <w:r>
           <w:rPr>
             <w:rStyle w:val="Hyperlink"/>
@@ -630,7 +687,7 @@
       <w:r>
         <w:t xml:space="preserve"> </w:t>
       </w:r>
-      <w:hyperlink r:id="rId22">
+      <w:hyperlink r:id="rId24">
         <w:r>
           <w:rPr>
             <w:rStyle w:val="Hyperlink"/>
@@ -666,8 +723,8 @@
         <w:t xml:space="preserve">.</w:t>
       </w:r>
     </w:p>
-    <w:bookmarkEnd w:id="23"/>
-    <w:bookmarkStart w:id="24" w:name="building-the-website"/>
+    <w:bookmarkEnd w:id="25"/>
+    <w:bookmarkStart w:id="26" w:name="building-the-website"/>
     <w:p>
       <w:pPr>
         <w:pStyle w:val="Heading2"/>
@@ -749,8 +806,8 @@
         <w:t xml:space="preserve">directory, which is published to GitHub Pages.</w:t>
       </w:r>
     </w:p>
-    <w:bookmarkEnd w:id="24"/>
-    <w:bookmarkStart w:id="26" w:name="license"/>
+    <w:bookmarkEnd w:id="26"/>
+    <w:bookmarkStart w:id="28" w:name="license"/>
     <w:p>
       <w:pPr>
         <w:pStyle w:val="Heading2"/>
@@ -769,7 +826,7 @@
       <w:r>
         <w:t xml:space="preserve"> </w:t>
       </w:r>
-      <w:hyperlink r:id="rId25">
+      <w:hyperlink r:id="rId27">
         <w:r>
           <w:rPr>
             <w:rStyle w:val="VerbatimChar"/>
@@ -781,8 +838,8 @@
         <w:t xml:space="preserve">.</w:t>
       </w:r>
     </w:p>
-    <w:bookmarkEnd w:id="26"/>
-    <w:bookmarkStart w:id="28" w:name="references"/>
+    <w:bookmarkEnd w:id="28"/>
+    <w:bookmarkStart w:id="30" w:name="references"/>
     <w:p>
       <w:pPr>
         <w:pStyle w:val="Heading2"/>
@@ -791,9 +848,9 @@
         <w:t xml:space="preserve">References</w:t>
       </w:r>
     </w:p>
-    <w:bookmarkStart w:id="27" w:name="refs"/>
-    <w:bookmarkEnd w:id="27"/>
-    <w:bookmarkEnd w:id="28"/>
+    <w:bookmarkStart w:id="29" w:name="refs"/>
+    <w:bookmarkEnd w:id="29"/>
+    <w:bookmarkEnd w:id="30"/>
     <w:sectPr>
       <w:footnotePr>
         <w:numRestart w:val="eachSect"/>

</xml_diff>

<commit_message>
Deploying to gh-pages from @ Morrison-Lab/wai@2597bfdfae8cbe46f2522d0d236e991f91e3ef38 🚀
</commit_message>
<xml_diff>
--- a/index.docx
+++ b/index.docx
@@ -15,7 +15,7 @@
         <w:pStyle w:val="Date"/>
       </w:pPr>
       <w:r>
-        <w:t xml:space="preserve">Last modified: 2026-08-29 22:10:28 (PDT)</w:t>
+        <w:t xml:space="preserve">Last modified: 2026-08-29 22:12:54 (PDT)</w:t>
       </w:r>
     </w:p>
     <w:p>
@@ -228,7 +228,7 @@
         </w:tc>
       </w:tr>
     </w:tbl>
-    <w:bookmarkStart w:id="22" w:name="chapters"/>
+    <w:bookmarkStart w:id="24" w:name="chapters"/>
     <w:p>
       <w:pPr>
         <w:pStyle w:val="Heading2"/>
@@ -505,6 +505,54 @@
             <w:b/>
             <w:bCs/>
           </w:rPr>
+          <w:t xml:space="preserve">Make: Visual Automation and AI Agents</w:t>
+        </w:r>
+      </w:hyperlink>
+      <w:r>
+        <w:t xml:space="preserve">:</w:t>
+      </w:r>
+      <w:r>
+        <w:t xml:space="preserve"> </w:t>
+      </w:r>
+      <w:r>
+        <w:t xml:space="preserve">visual, no-code canvas for 3,000+ apps, scenarios, and AI agents with Make</w:t>
+      </w:r>
+      <w:r>
+        <w:t xml:space="preserve"> </w:t>
+      </w:r>
+      <w:r>
+        <w:t xml:space="preserve">Grid and MCP (see</w:t>
+      </w:r>
+      <w:r>
+        <w:t xml:space="preserve"> </w:t>
+      </w:r>
+      <w:hyperlink r:id="rId22">
+        <w:r>
+          <w:rPr>
+            <w:rStyle w:val="Hyperlink"/>
+          </w:rPr>
+          <w:t xml:space="preserve">make.com</w:t>
+        </w:r>
+      </w:hyperlink>
+      <w:r>
+        <w:t xml:space="preserve">)</w:t>
+      </w:r>
+    </w:p>
+    <w:p>
+      <w:pPr>
+        <w:pStyle w:val="Compact"/>
+        <w:numPr>
+          <w:ilvl w:val="0"/>
+          <w:numId w:val="1001"/>
+        </w:numPr>
+      </w:pPr>
+      <w:hyperlink r:id="rId23">
+        <w:r>
+          <w:rPr>
+            <w:rStyle w:val="Hyperlink"/>
+            <w:b/>
+            <w:bCs/>
+          </w:rPr>
           <w:t xml:space="preserve">Pull-Request Workflow with Agents</w:t>
         </w:r>
       </w:hyperlink>
@@ -653,8 +701,8 @@
         <w:t xml:space="preserve">extension</w:t>
       </w:r>
     </w:p>
-    <w:bookmarkEnd w:id="22"/>
-    <w:bookmarkStart w:id="25" w:name="about-this-website"/>
+    <w:bookmarkEnd w:id="24"/>
+    <w:bookmarkStart w:id="27" w:name="about-this-website"/>
     <w:p>
       <w:pPr>
         <w:pStyle w:val="Heading2"/>
@@ -673,7 +721,7 @@
       <w:r>
         <w:t xml:space="preserve"> </w:t>
       </w:r>
-      <w:hyperlink r:id="rId23">
+      <w:hyperlink r:id="rId25">
         <w:r>
           <w:rPr>
             <w:rStyle w:val="Hyperlink"/>
@@ -687,7 +735,7 @@
       <w:r>
         <w:t xml:space="preserve"> </w:t>
       </w:r>
-      <w:hyperlink r:id="rId24">
+      <w:hyperlink r:id="rId26">
         <w:r>
           <w:rPr>
             <w:rStyle w:val="Hyperlink"/>
@@ -723,8 +771,8 @@
         <w:t xml:space="preserve">.</w:t>
       </w:r>
     </w:p>
-    <w:bookmarkEnd w:id="25"/>
-    <w:bookmarkStart w:id="26" w:name="building-the-website"/>
+    <w:bookmarkEnd w:id="27"/>
+    <w:bookmarkStart w:id="28" w:name="building-the-website"/>
     <w:p>
       <w:pPr>
         <w:pStyle w:val="Heading2"/>
@@ -806,8 +854,8 @@
         <w:t xml:space="preserve">directory, which is published to GitHub Pages.</w:t>
       </w:r>
     </w:p>
-    <w:bookmarkEnd w:id="26"/>
-    <w:bookmarkStart w:id="28" w:name="license"/>
+    <w:bookmarkEnd w:id="28"/>
+    <w:bookmarkStart w:id="30" w:name="license"/>
     <w:p>
       <w:pPr>
         <w:pStyle w:val="Heading2"/>
@@ -826,7 +874,7 @@
       <w:r>
         <w:t xml:space="preserve"> </w:t>
       </w:r>
-      <w:hyperlink r:id="rId27">
+      <w:hyperlink r:id="rId29">
         <w:r>
           <w:rPr>
             <w:rStyle w:val="VerbatimChar"/>
@@ -838,8 +886,8 @@
         <w:t xml:space="preserve">.</w:t>
       </w:r>
     </w:p>
-    <w:bookmarkEnd w:id="28"/>
-    <w:bookmarkStart w:id="30" w:name="references"/>
+    <w:bookmarkEnd w:id="30"/>
+    <w:bookmarkStart w:id="32" w:name="references"/>
     <w:p>
       <w:pPr>
         <w:pStyle w:val="Heading2"/>
@@ -848,9 +896,9 @@
         <w:t xml:space="preserve">References</w:t>
       </w:r>
     </w:p>
-    <w:bookmarkStart w:id="29" w:name="refs"/>
-    <w:bookmarkEnd w:id="29"/>
-    <w:bookmarkEnd w:id="30"/>
+    <w:bookmarkStart w:id="31" w:name="refs"/>
+    <w:bookmarkEnd w:id="31"/>
+    <w:bookmarkEnd w:id="32"/>
     <w:sectPr>
       <w:footnotePr>
         <w:numRestart w:val="eachSect"/>

</xml_diff>